<commit_message>
updateReport localization and other wvrilmanebi
</commit_message>
<xml_diff>
--- a/src/UsersTBC.WebAPI/wwwroot/MailMerge.ExecuteWithRegions.docx
+++ b/src/UsersTBC.WebAPI/wwwroot/MailMerge.ExecuteWithRegions.docx
@@ -44,6 +44,337 @@
         <w:fldChar w:fldCharType="end"/>
       </w:r>
     </w:p>
+    <w:tbl>
+      <w:tblPr>
+        <w:tblStyle w:val="TableGrid"/>
+        <w:tblW w:w="0" w:type="auto"/>
+        <w:tblLook w:val="04A0" w:firstRow="1" w:lastRow="0" w:firstColumn="1" w:lastColumn="0" w:noHBand="0" w:noVBand="1"/>
+      </w:tblPr>
+      <w:tblGrid>
+        <w:gridCol w:w="4675"/>
+        <w:gridCol w:w="4675"/>
+      </w:tblGrid>
+      <w:tr>
+        <w:tc>
+          <w:tcPr>
+            <w:tcW w:w="4675" w:type="dxa"/>
+          </w:tcPr>
+          <w:p>
+            <w:r>
+              <w:rPr>
+                <w:noProof/>
+              </w:rPr>
+              <w:fldChar w:fldCharType="begin"/>
+            </w:r>
+            <w:r>
+              <w:rPr>
+                <w:noProof/>
+              </w:rPr>
+              <w:instrText xml:space="preserve"> MERGEFIELD  FirstName  \* MERGEFORMAT </w:instrText>
+            </w:r>
+            <w:r>
+              <w:rPr>
+                <w:noProof/>
+              </w:rPr>
+              <w:fldChar w:fldCharType="separate"/>
+            </w:r>
+            <w:r>
+              <w:rPr>
+                <w:noProof/>
+              </w:rPr>
+              <w:t>«FirstName»</w:t>
+            </w:r>
+            <w:r>
+              <w:rPr>
+                <w:noProof/>
+              </w:rPr>
+              <w:fldChar w:fldCharType="end"/>
+            </w:r>
+          </w:p>
+          <w:p>
+            <w:r>
+              <w:rPr>
+                <w:noProof/>
+              </w:rPr>
+              <w:fldChar w:fldCharType="begin"/>
+            </w:r>
+            <w:r>
+              <w:rPr>
+                <w:noProof/>
+              </w:rPr>
+              <w:instrText xml:space="preserve"> MERGEFIELD  LastName  \* MERGEFORMAT </w:instrText>
+            </w:r>
+            <w:r>
+              <w:rPr>
+                <w:noProof/>
+              </w:rPr>
+              <w:fldChar w:fldCharType="separate"/>
+            </w:r>
+            <w:r>
+              <w:rPr>
+                <w:noProof/>
+              </w:rPr>
+              <w:t>«LastName»</w:t>
+            </w:r>
+            <w:r>
+              <w:rPr>
+                <w:noProof/>
+              </w:rPr>
+              <w:fldChar w:fldCharType="end"/>
+            </w:r>
+          </w:p>
+          <w:p>
+            <w:pPr>
+              <w:rPr>
+                <w:noProof/>
+              </w:rPr>
+            </w:pPr>
+          </w:p>
+        </w:tc>
+        <w:tc>
+          <w:tcPr>
+            <w:tcW w:w="4675" w:type="dxa"/>
+          </w:tcPr>
+          <w:p>
+            <w:pPr>
+              <w:rPr>
+                <w:noProof/>
+              </w:rPr>
+            </w:pPr>
+            <w:r>
+              <w:rPr>
+                <w:noProof/>
+                <w:highlight w:val="green"/>
+              </w:rPr>
+              <w:fldChar w:fldCharType="begin"/>
+            </w:r>
+            <w:r>
+              <w:rPr>
+                <w:noProof/>
+                <w:highlight w:val="green"/>
+              </w:rPr>
+              <w:instrText xml:space="preserve"> MERGEFIELD  TableStart:userRelateds  \* MERGEFORMAT </w:instrText>
+            </w:r>
+            <w:r>
+              <w:rPr>
+                <w:noProof/>
+                <w:highlight w:val="green"/>
+              </w:rPr>
+              <w:fldChar w:fldCharType="separate"/>
+            </w:r>
+            <w:r>
+              <w:rPr>
+                <w:noProof/>
+                <w:highlight w:val="green"/>
+              </w:rPr>
+              <w:t>«TableStart:userRelateds»</w:t>
+            </w:r>
+            <w:r>
+              <w:rPr>
+                <w:noProof/>
+                <w:highlight w:val="green"/>
+              </w:rPr>
+              <w:fldChar w:fldCharType="end"/>
+            </w:r>
+          </w:p>
+          <w:tbl>
+            <w:tblPr>
+              <w:tblStyle w:val="TableGrid"/>
+              <w:tblW w:w="0" w:type="auto"/>
+              <w:tblLook w:val="04A0" w:firstRow="1" w:lastRow="0" w:firstColumn="1" w:lastColumn="0" w:noHBand="0" w:noVBand="1"/>
+            </w:tblPr>
+            <w:tblGrid>
+              <w:gridCol w:w="4449"/>
+            </w:tblGrid>
+            <w:tr>
+              <w:tc>
+                <w:tcPr>
+                  <w:tcW w:w="4449" w:type="dxa"/>
+                </w:tcPr>
+                <w:p>
+                  <w:pPr>
+                    <w:rPr>
+                      <w:noProof/>
+                      <w:highlight w:val="cyan"/>
+                    </w:rPr>
+                  </w:pPr>
+                  <w:r>
+                    <w:rPr>
+                      <w:noProof/>
+                      <w:highlight w:val="cyan"/>
+                    </w:rPr>
+                    <w:fldChar w:fldCharType="begin"/>
+                  </w:r>
+                  <w:r>
+                    <w:rPr>
+                      <w:noProof/>
+                      <w:highlight w:val="cyan"/>
+                    </w:rPr>
+                    <w:instrText xml:space="preserve"> MERGEFIELD  TableStart:RelatedUser  \* MERGEFORMAT </w:instrText>
+                  </w:r>
+                  <w:r>
+                    <w:rPr>
+                      <w:noProof/>
+                      <w:highlight w:val="cyan"/>
+                    </w:rPr>
+                    <w:fldChar w:fldCharType="separate"/>
+                  </w:r>
+                  <w:r>
+                    <w:rPr>
+                      <w:noProof/>
+                      <w:highlight w:val="cyan"/>
+                    </w:rPr>
+                    <w:t>«TableStart:RelatedUser»</w:t>
+                  </w:r>
+                  <w:r>
+                    <w:rPr>
+                      <w:noProof/>
+                      <w:highlight w:val="cyan"/>
+                    </w:rPr>
+                    <w:fldChar w:fldCharType="end"/>
+                  </w:r>
+                </w:p>
+                <w:p>
+                  <w:pPr>
+                    <w:rPr>
+                      <w:noProof/>
+                    </w:rPr>
+                  </w:pPr>
+                  <w:r>
+                    <w:rPr>
+                      <w:noProof/>
+                    </w:rPr>
+                    <w:fldChar w:fldCharType="begin"/>
+                  </w:r>
+                  <w:r>
+                    <w:rPr>
+                      <w:noProof/>
+                    </w:rPr>
+                    <w:instrText xml:space="preserve"> MERGEFIELD  FirstName  \* MERGEFORMAT </w:instrText>
+                  </w:r>
+                  <w:r>
+                    <w:rPr>
+                      <w:noProof/>
+                    </w:rPr>
+                    <w:fldChar w:fldCharType="separate"/>
+                  </w:r>
+                  <w:r>
+                    <w:rPr>
+                      <w:noProof/>
+                    </w:rPr>
+                    <w:t>«FirstName»</w:t>
+                  </w:r>
+                  <w:r>
+                    <w:rPr>
+                      <w:noProof/>
+                    </w:rPr>
+                    <w:fldChar w:fldCharType="end"/>
+                  </w:r>
+                </w:p>
+                <w:p>
+                  <w:pPr>
+                    <w:rPr>
+                      <w:noProof/>
+                    </w:rPr>
+                  </w:pPr>
+                  <w:r>
+                    <w:rPr>
+                      <w:noProof/>
+                      <w:highlight w:val="cyan"/>
+                    </w:rPr>
+                    <w:fldChar w:fldCharType="begin"/>
+                  </w:r>
+                  <w:r>
+                    <w:rPr>
+                      <w:noProof/>
+                      <w:highlight w:val="cyan"/>
+                    </w:rPr>
+                    <w:instrText xml:space="preserve"> MERGEFIELD  TableEnd:RelatedUser  \* MERGEFORMAT </w:instrText>
+                  </w:r>
+                  <w:r>
+                    <w:rPr>
+                      <w:noProof/>
+                      <w:highlight w:val="cyan"/>
+                    </w:rPr>
+                    <w:fldChar w:fldCharType="separate"/>
+                  </w:r>
+                  <w:r>
+                    <w:rPr>
+                      <w:noProof/>
+                      <w:highlight w:val="cyan"/>
+                    </w:rPr>
+                    <w:t>«TableEnd:RelatedUser»</w:t>
+                  </w:r>
+                  <w:r>
+                    <w:rPr>
+                      <w:noProof/>
+                      <w:highlight w:val="cyan"/>
+                    </w:rPr>
+                    <w:fldChar w:fldCharType="end"/>
+                  </w:r>
+                </w:p>
+                <w:p>
+                  <w:pPr>
+                    <w:rPr>
+                      <w:noProof/>
+                    </w:rPr>
+                  </w:pPr>
+                </w:p>
+              </w:tc>
+            </w:tr>
+          </w:tbl>
+          <w:p>
+            <w:pPr>
+              <w:rPr>
+                <w:noProof/>
+              </w:rPr>
+            </w:pPr>
+            <w:r>
+              <w:rPr>
+                <w:noProof/>
+                <w:highlight w:val="green"/>
+              </w:rPr>
+              <w:fldChar w:fldCharType="begin"/>
+            </w:r>
+            <w:r>
+              <w:rPr>
+                <w:noProof/>
+                <w:highlight w:val="green"/>
+              </w:rPr>
+              <w:instrText xml:space="preserve"> MERGEFIELD  TableEnd:userRelateds  \* MERGEFORMAT </w:instrText>
+            </w:r>
+            <w:r>
+              <w:rPr>
+                <w:noProof/>
+                <w:highlight w:val="green"/>
+              </w:rPr>
+              <w:fldChar w:fldCharType="separate"/>
+            </w:r>
+            <w:r>
+              <w:rPr>
+                <w:noProof/>
+                <w:highlight w:val="green"/>
+              </w:rPr>
+              <w:t>«TableEnd:userRelateds»</w:t>
+            </w:r>
+            <w:r>
+              <w:rPr>
+                <w:noProof/>
+                <w:highlight w:val="green"/>
+              </w:rPr>
+              <w:fldChar w:fldCharType="end"/>
+            </w:r>
+          </w:p>
+          <w:p>
+            <w:pPr>
+              <w:rPr>
+                <w:noProof/>
+              </w:rPr>
+            </w:pPr>
+          </w:p>
+        </w:tc>
+      </w:tr>
+    </w:tbl>
     <w:p>
       <w:pPr>
         <w:rPr>
@@ -51,320 +382,8 @@
         </w:rPr>
       </w:pPr>
     </w:p>
-    <w:p>
-      <w:r>
-        <w:rPr>
-          <w:noProof/>
-        </w:rPr>
-        <w:fldChar w:fldCharType="begin"/>
-      </w:r>
-      <w:r>
-        <w:rPr>
-          <w:noProof/>
-        </w:rPr>
-        <w:instrText xml:space="preserve"> MERGEFIELD  FirstName  \* MERGEFORMAT </w:instrText>
-      </w:r>
-      <w:r>
-        <w:rPr>
-          <w:noProof/>
-        </w:rPr>
-        <w:fldChar w:fldCharType="separate"/>
-      </w:r>
-      <w:r>
-        <w:rPr>
-          <w:noProof/>
-        </w:rPr>
-        <w:t>«FirstName»</w:t>
-      </w:r>
-      <w:r>
-        <w:rPr>
-          <w:noProof/>
-        </w:rPr>
-        <w:fldChar w:fldCharType="end"/>
-      </w:r>
-    </w:p>
-    <w:p>
-      <w:r>
-        <w:t>1</w:t>
-      </w:r>
-    </w:p>
-    <w:p>
-      <w:r>
-        <w:rPr>
-          <w:noProof/>
-        </w:rPr>
-        <w:fldChar w:fldCharType="begin"/>
-      </w:r>
-      <w:r>
-        <w:rPr>
-          <w:noProof/>
-        </w:rPr>
-        <w:instrText xml:space="preserve"> MERGEFIELD  LastName  \* MERGEFORMAT </w:instrText>
-      </w:r>
-      <w:r>
-        <w:rPr>
-          <w:noProof/>
-        </w:rPr>
-        <w:fldChar w:fldCharType="separate"/>
-      </w:r>
-      <w:r>
-        <w:rPr>
-          <w:noProof/>
-        </w:rPr>
-        <w:t>«LastName»</w:t>
-      </w:r>
-      <w:r>
-        <w:rPr>
-          <w:noProof/>
-        </w:rPr>
-        <w:fldChar w:fldCharType="end"/>
-      </w:r>
-    </w:p>
-    <w:p>
-      <w:pPr>
-        <w:rPr>
-          <w:noProof/>
-        </w:rPr>
-      </w:pPr>
-      <w:r>
-        <w:rPr>
-          <w:noProof/>
-          <w:highlight w:val="green"/>
-        </w:rPr>
-        <w:fldChar w:fldCharType="begin"/>
-      </w:r>
-      <w:r>
-        <w:rPr>
-          <w:noProof/>
-          <w:highlight w:val="green"/>
-        </w:rPr>
-        <w:instrText xml:space="preserve"> MERGEFIELD  TableStart:userRelateds  \* MERGEFORMAT </w:instrText>
-      </w:r>
-      <w:r>
-        <w:rPr>
-          <w:noProof/>
-          <w:highlight w:val="green"/>
-        </w:rPr>
-        <w:fldChar w:fldCharType="separate"/>
-      </w:r>
-      <w:r>
-        <w:rPr>
-          <w:noProof/>
-          <w:highlight w:val="green"/>
-        </w:rPr>
-        <w:t>«TableStart:userRelateds»</w:t>
-      </w:r>
-      <w:r>
-        <w:rPr>
-          <w:noProof/>
-          <w:highlight w:val="green"/>
-        </w:rPr>
-        <w:fldChar w:fldCharType="end"/>
-      </w:r>
-    </w:p>
-    <w:p>
-      <w:pPr>
-        <w:rPr>
-          <w:noProof/>
-        </w:rPr>
-      </w:pPr>
-      <w:r>
-        <w:rPr>
-          <w:noProof/>
-        </w:rPr>
-        <w:fldChar w:fldCharType="begin"/>
-      </w:r>
-      <w:r>
-        <w:rPr>
-          <w:noProof/>
-        </w:rPr>
-        <w:instrText xml:space="preserve"> MERGEFIELD  RelatedUserId  \* MERGEFORMAT </w:instrText>
-      </w:r>
-      <w:r>
-        <w:rPr>
-          <w:noProof/>
-        </w:rPr>
-        <w:fldChar w:fldCharType="separate"/>
-      </w:r>
-      <w:r>
-        <w:rPr>
-          <w:noProof/>
-        </w:rPr>
-        <w:t>«RelatedUserId»</w:t>
-      </w:r>
-      <w:r>
-        <w:rPr>
-          <w:noProof/>
-        </w:rPr>
-        <w:fldChar w:fldCharType="end"/>
-      </w:r>
-    </w:p>
-    <w:p>
-      <w:pPr>
-        <w:rPr>
-          <w:noProof/>
-          <w:highlight w:val="cyan"/>
-        </w:rPr>
-      </w:pPr>
-      <w:r>
-        <w:rPr>
-          <w:noProof/>
-          <w:highlight w:val="cyan"/>
-        </w:rPr>
-        <w:fldChar w:fldCharType="begin"/>
-      </w:r>
-      <w:r>
-        <w:rPr>
-          <w:noProof/>
-          <w:highlight w:val="cyan"/>
-        </w:rPr>
-        <w:instrText xml:space="preserve"> MERGEFIELD  TableStart:RelatedUser  \* MERGEFORMAT </w:instrText>
-      </w:r>
-      <w:r>
-        <w:rPr>
-          <w:noProof/>
-          <w:highlight w:val="cyan"/>
-        </w:rPr>
-        <w:fldChar w:fldCharType="separate"/>
-      </w:r>
-      <w:r>
-        <w:rPr>
-          <w:noProof/>
-          <w:highlight w:val="cyan"/>
-        </w:rPr>
-        <w:t>«TableStart:RelatedUser»</w:t>
-      </w:r>
-      <w:r>
-        <w:rPr>
-          <w:noProof/>
-          <w:highlight w:val="cyan"/>
-        </w:rPr>
-        <w:fldChar w:fldCharType="end"/>
-      </w:r>
-    </w:p>
-    <w:p>
-      <w:pPr>
-        <w:rPr>
-          <w:noProof/>
-        </w:rPr>
-      </w:pPr>
-      <w:r>
-        <w:rPr>
-          <w:noProof/>
-        </w:rPr>
-        <w:fldChar w:fldCharType="begin"/>
-      </w:r>
-      <w:r>
-        <w:rPr>
-          <w:noProof/>
-        </w:rPr>
-        <w:instrText xml:space="preserve"> MERGEFIELD  FirstName  \* MERGEFORMAT </w:instrText>
-      </w:r>
-      <w:r>
-        <w:rPr>
-          <w:noProof/>
-        </w:rPr>
-        <w:fldChar w:fldCharType="separate"/>
-      </w:r>
-      <w:r>
-        <w:rPr>
-          <w:noProof/>
-        </w:rPr>
-        <w:t>«FirstName»</w:t>
-      </w:r>
-      <w:r>
-        <w:rPr>
-          <w:noProof/>
-        </w:rPr>
-        <w:fldChar w:fldCharType="end"/>
-      </w:r>
-      <w:bookmarkStart w:id="0" w:name="_GoBack"/>
-      <w:bookmarkEnd w:id="0"/>
-    </w:p>
-    <w:p>
-      <w:pPr>
-        <w:rPr>
-          <w:noProof/>
-        </w:rPr>
-      </w:pPr>
-      <w:r>
-        <w:rPr>
-          <w:noProof/>
-          <w:highlight w:val="cyan"/>
-        </w:rPr>
-        <w:fldChar w:fldCharType="begin"/>
-      </w:r>
-      <w:r>
-        <w:rPr>
-          <w:noProof/>
-          <w:highlight w:val="cyan"/>
-        </w:rPr>
-        <w:instrText xml:space="preserve"> MERGEFIELD  TableEnd:RelatedUser  \* MERGEFORMAT </w:instrText>
-      </w:r>
-      <w:r>
-        <w:rPr>
-          <w:noProof/>
-          <w:highlight w:val="cyan"/>
-        </w:rPr>
-        <w:fldChar w:fldCharType="separate"/>
-      </w:r>
-      <w:r>
-        <w:rPr>
-          <w:noProof/>
-          <w:highlight w:val="cyan"/>
-        </w:rPr>
-        <w:t>«TableEnd:RelatedUser»</w:t>
-      </w:r>
-      <w:r>
-        <w:rPr>
-          <w:noProof/>
-          <w:highlight w:val="cyan"/>
-        </w:rPr>
-        <w:fldChar w:fldCharType="end"/>
-      </w:r>
-    </w:p>
-    <w:p>
-      <w:pPr>
-        <w:rPr>
-          <w:noProof/>
-        </w:rPr>
-      </w:pPr>
-      <w:r>
-        <w:rPr>
-          <w:noProof/>
-          <w:highlight w:val="green"/>
-        </w:rPr>
-        <w:fldChar w:fldCharType="begin"/>
-      </w:r>
-      <w:r>
-        <w:rPr>
-          <w:noProof/>
-          <w:highlight w:val="green"/>
-        </w:rPr>
-        <w:instrText xml:space="preserve"> MERGEFIELD  TableEnd:userRelateds  \* MERGEFORMAT </w:instrText>
-      </w:r>
-      <w:r>
-        <w:rPr>
-          <w:noProof/>
-          <w:highlight w:val="green"/>
-        </w:rPr>
-        <w:fldChar w:fldCharType="separate"/>
-      </w:r>
-      <w:r>
-        <w:rPr>
-          <w:noProof/>
-          <w:highlight w:val="green"/>
-        </w:rPr>
-        <w:t>«TableEnd:userRelateds»</w:t>
-      </w:r>
-      <w:r>
-        <w:rPr>
-          <w:noProof/>
-          <w:highlight w:val="green"/>
-        </w:rPr>
-        <w:fldChar w:fldCharType="end"/>
-      </w:r>
-    </w:p>
+    <w:bookmarkStart w:id="0" w:name="_GoBack"/>
+    <w:bookmarkEnd w:id="0"/>
     <w:p>
       <w:pPr>
         <w:rPr>
@@ -850,6 +869,25 @@
     <w:semiHidden/>
     <w:unhideWhenUsed/>
   </w:style>
+  <w:style w:type="table" w:styleId="TableGrid">
+    <w:name w:val="Table Grid"/>
+    <w:basedOn w:val="TableNormal"/>
+    <w:uiPriority w:val="39"/>
+    <w:rsid w:val="00110736"/>
+    <w:pPr>
+      <w:spacing w:after="0" w:line="240" w:lineRule="auto"/>
+    </w:pPr>
+    <w:tblPr>
+      <w:tblBorders>
+        <w:top w:val="single" w:sz="4" w:space="0" w:color="auto"/>
+        <w:left w:val="single" w:sz="4" w:space="0" w:color="auto"/>
+        <w:bottom w:val="single" w:sz="4" w:space="0" w:color="auto"/>
+        <w:right w:val="single" w:sz="4" w:space="0" w:color="auto"/>
+        <w:insideH w:val="single" w:sz="4" w:space="0" w:color="auto"/>
+        <w:insideV w:val="single" w:sz="4" w:space="0" w:color="auto"/>
+      </w:tblBorders>
+    </w:tblPr>
+  </w:style>
 </w:styles>
 </file>
 

</xml_diff>